<commit_message>
Lit review: add Feb-Aug 2026 sweep
Six-month update ahead of launch. Headline: novelty intact, no study
randomizes clinicians to AI vs reference during clinical work with an
unassisted knowledge outcome. Adds: Ke et al. never-skilling (Nat Med,
full citation), Annals deskilling commentary, the 20-RCT meta-analysis of
GenAI teaching interventions (fills placeholder ref 16), the ophthalmology
LLM RCT showing scaffolding rather than erosion (counterpoint for the
Discussion), the methodological critique of Kosmyna, the colonoscopy
taxonomy editorial, the Nat Med primary-care cluster RCT, a rare-disease
assistance RCT, and three supporting preprints/perspectives.

Co-Authored-By: Claude Opus 4.7 <noreply@anthropic.com>
</commit_message>
<xml_diff>
--- a/docs/Literature-Review-Annotated.docx
+++ b/docs/Literature-Review-Annotated.docx
@@ -2,7 +2,7 @@
 <file path=word/document.xml><?xml version="1.0" encoding="utf-8"?>
 <w:document xmlns:w="http://schemas.openxmlformats.org/wordprocessingml/2006/main" xmlns:m="http://schemas.openxmlformats.org/officeDocument/2006/math" xmlns:r="http://schemas.openxmlformats.org/officeDocument/2006/relationships" xmlns:o="urn:schemas-microsoft-com:office:office" xmlns:v="urn:schemas-microsoft-com:vml" xmlns:w10="urn:schemas-microsoft-com:office:word" xmlns:a="http://schemas.openxmlformats.org/drawingml/2006/main" xmlns:pic="http://schemas.openxmlformats.org/drawingml/2006/picture" xmlns:wp="http://schemas.openxmlformats.org/drawingml/2006/wordprocessingDrawing">
   <w:body>
-    <w:bookmarkStart w:id="17" w:name="Xd6e98cf6afdc20909884c0886158359efc905c2"/>
+    <w:bookmarkStart w:id="18" w:name="Xd6e98cf6afdc20909884c0886158359efc905c2"/>
     <w:p>
       <w:pPr>
         <w:pStyle w:val="Heading1"/>
@@ -1991,8 +1991,311 @@
         <w:t xml:space="preserve">were assembled by literature search — confirm authors, volume, and pages against the primary sources before submission, and decide which preprints (Kosmyna; novice-programmer; Goh management) to cite as preprints vs. await final publication.</w:t>
       </w:r>
     </w:p>
+    <w:p>
+      <w:r>
+        <w:pict>
+          <v:rect style="width:0;height:1.5pt" o:hralign="center" o:hrstd="t" o:hr="t"/>
+        </w:pict>
+      </w:r>
+    </w:p>
     <w:bookmarkEnd w:id="16"/>
+    <w:bookmarkStart w:id="17" w:name="X4ed73efbf8d5a7e1b3d1997a6533403739146cc"/>
+    <w:p>
+      <w:pPr>
+        <w:pStyle w:val="Heading2"/>
+      </w:pPr>
+      <w:r>
+        <w:t xml:space="preserve">New since the last sweep (compiled 2026-08-25, covering roughly Feb–Aug 2026)</w:t>
+      </w:r>
+    </w:p>
+    <w:p>
+      <w:pPr>
+        <w:pStyle w:val="FirstParagraph"/>
+      </w:pPr>
+      <w:r>
+        <w:rPr>
+          <w:b/>
+          <w:bCs/>
+        </w:rPr>
+        <w:t xml:space="preserve">Headline for the manuscript: novelty is intact.</w:t>
+      </w:r>
+      <w:r>
+        <w:t xml:space="preserve"> </w:t>
+      </w:r>
+      <w:r>
+        <w:t xml:space="preserve">Nothing published in this window randomizes clinicians to AI versus a standard reference during clinical work and then measures unassisted knowledge afterward. The new literature strengthens the framing (the taxonomy is now mainstream and the deliberate-use evidence has a meta-analysis) and adds one genuine counterpoint to engage in the Discussion.</w:t>
+      </w:r>
+    </w:p>
+    <w:p>
+      <w:pPr>
+        <w:pStyle w:val="BodyText"/>
+      </w:pPr>
+      <w:r>
+        <w:rPr>
+          <w:b/>
+          <w:bCs/>
+        </w:rPr>
+        <w:t xml:space="preserve">NEW — Ke Y, et al. AI-induced never-skilling in medical education. Nat Med. 2026;32(6):1997–2006.</w:t>
+      </w:r>
+      <w:r>
+        <w:t xml:space="preserve"> </w:t>
+      </w:r>
+      <w:r>
+        <w:rPr>
+          <w:i/>
+          <w:iCs/>
+        </w:rPr>
+        <w:t xml:space="preserve">(verify author list)</w:t>
+      </w:r>
+      <w:r>
+        <w:t xml:space="preserve"> </w:t>
+      </w:r>
+      <w:r>
+        <w:t xml:space="preserve">Full peer-reviewed treatment of never-skilling, with a competency-protective framework, distinguishing it from de-skilling in experienced clinicians and from mis-skilling. Nature Medicine venue makes this the strongest citation for the taxonomy alongside Abdulnour. Add to the manuscript at the taxonomy sentence (currently ref 15 alone).</w:t>
+      </w:r>
+    </w:p>
+    <w:p>
+      <w:pPr>
+        <w:pStyle w:val="BodyText"/>
+      </w:pPr>
+      <w:r>
+        <w:rPr>
+          <w:b/>
+          <w:bCs/>
+        </w:rPr>
+        <w:t xml:space="preserve">NEW — The deskilling effect: is artificial intelligence eroding clinical competence? Ann Intern Med. 2026 (doi 10.7326/ANNALS-26-00613).</w:t>
+      </w:r>
+      <w:r>
+        <w:t xml:space="preserve"> </w:t>
+      </w:r>
+      <w:r>
+        <w:rPr>
+          <w:i/>
+          <w:iCs/>
+        </w:rPr>
+        <w:t xml:space="preserve">(verify authors/type)</w:t>
+      </w:r>
+      <w:r>
+        <w:t xml:space="preserve"> </w:t>
+      </w:r>
+      <w:r>
+        <w:t xml:space="preserve">The concern has reached the flagship internal-medicine journal — the study population’s own literature. Useful in the Introduction to show the worry is now mainstream in IM, still without randomized evidence for cognitive tasks.</w:t>
+      </w:r>
+    </w:p>
+    <w:p>
+      <w:pPr>
+        <w:pStyle w:val="BodyText"/>
+      </w:pPr>
+      <w:r>
+        <w:rPr>
+          <w:b/>
+          <w:bCs/>
+        </w:rPr>
+        <w:t xml:space="preserve">NEW — Systematic review and meta-analysis: integrating generative AI into medical education, short-term learning outcomes. 2026 (PMC13274167).</w:t>
+      </w:r>
+      <w:r>
+        <w:t xml:space="preserve"> </w:t>
+      </w:r>
+      <w:r>
+        <w:rPr>
+          <w:i/>
+          <w:iCs/>
+        </w:rPr>
+        <w:t xml:space="preserve">(verify citation)</w:t>
+      </w:r>
+      <w:r>
+        <w:t xml:space="preserve"> </w:t>
+      </w:r>
+      <w:r>
+        <w:t xml:space="preserve">Twenty RCTs, n = 1,413: generative-AI teaching interventions improved post-intervention knowledge and skill scores, retained at follow-up. This is the</w:t>
+      </w:r>
+      <w:r>
+        <w:t xml:space="preserve"> </w:t>
+      </w:r>
+      <w:r>
+        <w:rPr>
+          <w:i/>
+          <w:iCs/>
+        </w:rPr>
+        <w:t xml:space="preserve">deliberate-use</w:t>
+      </w:r>
+      <w:r>
+        <w:t xml:space="preserve"> </w:t>
+      </w:r>
+      <w:r>
+        <w:t xml:space="preserve">evidence base in aggregate — AI configured as a teaching tool works — which sharpens our distinction: the incidental case remains untested. Strong candidate to fill placeholder ref 16.</w:t>
+      </w:r>
+    </w:p>
+    <w:p>
+      <w:pPr>
+        <w:pStyle w:val="BodyText"/>
+      </w:pPr>
+      <w:r>
+        <w:rPr>
+          <w:b/>
+          <w:bCs/>
+        </w:rPr>
+        <w:t xml:space="preserve">NEW — The effectiveness of large language models in medical AI research for physicians: a randomized controlled trial. Cell Rep Med. 2025 (Nov; PMC12765838).</w:t>
+      </w:r>
+      <w:r>
+        <w:t xml:space="preserve"> </w:t>
+      </w:r>
+      <w:r>
+        <w:rPr>
+          <w:i/>
+          <w:iCs/>
+        </w:rPr>
+        <w:t xml:space="preserve">(verify citation)</w:t>
+      </w:r>
+      <w:r>
+        <w:t xml:space="preserve"> </w:t>
+      </w:r>
+      <w:r>
+        <w:t xml:space="preserve">Sixty-four junior ophthalmologists learned to build a machine-learning project with or without ChatGPT-3.5. The LLM group had higher completion (87.5% vs 25.0%) and higher</w:t>
+      </w:r>
+      <w:r>
+        <w:t xml:space="preserve"> </w:t>
+      </w:r>
+      <w:r>
+        <w:rPr>
+          <w:i/>
+          <w:iCs/>
+        </w:rPr>
+        <w:t xml:space="preserve">unassisted</w:t>
+      </w:r>
+      <w:r>
+        <w:t xml:space="preserve"> </w:t>
+      </w:r>
+      <w:r>
+        <w:t xml:space="preserve">completion, and after a two-week washout 41.2% completed a new project without LLM support. A genuine counterpoint: in a technical-skills domain, AI assistance scaffolded rather than eroded subsequent independent capability. Engage in the Discussion — outcome direction may be domain- and task-dependent.</w:t>
+      </w:r>
+    </w:p>
+    <w:p>
+      <w:pPr>
+        <w:pStyle w:val="BodyText"/>
+      </w:pPr>
+      <w:r>
+        <w:rPr>
+          <w:b/>
+          <w:bCs/>
+        </w:rPr>
+        <w:t xml:space="preserve">NEW — Comment on Kosmyna et al. arXiv:2601.00856 (Jan 2026).</w:t>
+      </w:r>
+      <w:r>
+        <w:t xml:space="preserve"> </w:t>
+      </w:r>
+      <w:r>
+        <w:t xml:space="preserve">Formal methodological critique of the</w:t>
+      </w:r>
+      <w:r>
+        <w:t xml:space="preserve"> </w:t>
+      </w:r>
+      <w:r>
+        <w:t xml:space="preserve">“cognitive debt”</w:t>
+      </w:r>
+      <w:r>
+        <w:t xml:space="preserve"> </w:t>
+      </w:r>
+      <w:r>
+        <w:t xml:space="preserve">EEG preprint (design, reproducibility, interpretation). Our manuscript cites Kosmyna (ref 7); keep the claim modest, keep the preprint label, or drop the neural-persistence clause if a reviewer pushes.</w:t>
+      </w:r>
+    </w:p>
+    <w:p>
+      <w:pPr>
+        <w:pStyle w:val="BodyText"/>
+      </w:pPr>
+      <w:r>
+        <w:rPr>
+          <w:b/>
+          <w:bCs/>
+        </w:rPr>
+        <w:t xml:space="preserve">NEW — Upskilling, deskilling, or never skilling — who benefits from AI in colonoscopy? 2026 (PMID 42250888).</w:t>
+      </w:r>
+      <w:r>
+        <w:t xml:space="preserve"> </w:t>
+      </w:r>
+      <w:r>
+        <w:t xml:space="preserve">Editorial applying the taxonomy within GI after the Budzyń data; evidence the vocabulary has propagated into specialty discourse.</w:t>
+      </w:r>
+    </w:p>
+    <w:p>
+      <w:pPr>
+        <w:pStyle w:val="BodyText"/>
+      </w:pPr>
+      <w:r>
+        <w:rPr>
+          <w:b/>
+          <w:bCs/>
+        </w:rPr>
+        <w:t xml:space="preserve">NEW — Generative AI-enabled clinical decision support in primary care: pragmatic cluster-randomized trial. Nat Med. 2026 (s41591-026-04503-6).</w:t>
+      </w:r>
+      <w:r>
+        <w:t xml:space="preserve"> </w:t>
+      </w:r>
+      <w:r>
+        <w:rPr>
+          <w:i/>
+          <w:iCs/>
+        </w:rPr>
+        <w:t xml:space="preserve">(verify)</w:t>
+      </w:r>
+      <w:r>
+        <w:t xml:space="preserve"> </w:t>
+      </w:r>
+      <w:r>
+        <w:t xml:space="preserve">Large point-of-care trial of GenAI decision support — assisted performance again, no learning outcome; updates the</w:t>
+      </w:r>
+      <w:r>
+        <w:t xml:space="preserve"> </w:t>
+      </w:r>
+      <w:r>
+        <w:t xml:space="preserve">“trials measure assisted performance”</w:t>
+      </w:r>
+      <w:r>
+        <w:t xml:space="preserve"> </w:t>
+      </w:r>
+      <w:r>
+        <w:t xml:space="preserve">sentence with a current flagship example.</w:t>
+      </w:r>
+    </w:p>
+    <w:p>
+      <w:pPr>
+        <w:pStyle w:val="BodyText"/>
+      </w:pPr>
+      <w:r>
+        <w:rPr>
+          <w:b/>
+          <w:bCs/>
+        </w:rPr>
+        <w:t xml:space="preserve">NEW — Specialized reasoning LLM for rare-disease diagnosis: randomized physician-assistance trial. arXiv:2606.24510 (Jun 2026).</w:t>
+      </w:r>
+      <w:r>
+        <w:t xml:space="preserve"> </w:t>
+      </w:r>
+      <w:r>
+        <w:t xml:space="preserve">Assisted-performance RCT in rare-disease diagnosis specifically — adjacent to our Fabry case; same endpoint gap.</w:t>
+      </w:r>
+    </w:p>
+    <w:p>
+      <w:pPr>
+        <w:pStyle w:val="BodyText"/>
+      </w:pPr>
+      <w:r>
+        <w:rPr>
+          <w:b/>
+          <w:bCs/>
+        </w:rPr>
+        <w:t xml:space="preserve">NEW — Path dependence under adaptive AI delegation. arXiv:2603.02950 (Mar 2026); Brainrot: deskilling and addiction are overlooked AI risks. arXiv:2605.03512 (May 2026); Oettl et al., From de-skilling to up-skilling, J Exp Orthop 2026.</w:t>
+      </w:r>
+      <w:r>
+        <w:t xml:space="preserve"> </w:t>
+      </w:r>
+      <w:r>
+        <w:t xml:space="preserve">Supporting texture: delegation dynamics and skill trajectories, a risks framing, and an optimistic up-skilling counterpoint. Optional citations; useful for the Discussion’s balance.</w:t>
+      </w:r>
+    </w:p>
     <w:bookmarkEnd w:id="17"/>
+    <w:bookmarkEnd w:id="18"/>
     <w:sectPr>
       <w:footnotePr>
         <w:numRestart w:val="eachSect"/>

</xml_diff>